<commit_message>
style(p6): clean title-page author labels (em-dash/comma -> colon)
Standardise the First/Corresponding Author labels on all three P6 meta-analysis
title pages (JWB/JIM/APJM) to a colon, and repair a prior naive em-dash->comma
swap on the JIM page that left '**First Author , **'. Parenthetical em-dash ->
comma. Rebuilt the title-page .docx.

P6 numbers reconcile against canonical (table1_baseline.csv): r=0.074 [0.060,
0.088], K=288/k=238, I2=62.4%, Q_M=17.35, Egger 0.487, adj r=0.035 -- all three
manuscripts mutually consistent; no number changes needed.

Co-Authored-By: Claude Opus 4.8 (1M context) <noreply@anthropic.com>
Claude-Session: https://claude.ai/code/session_01Xumaoraa2DLWLXsgJJ62oq
</commit_message>
<xml_diff>
--- a/p6/submission/apjm_package/02_title_page.docx
+++ b/p6/submission/apjm_package/02_title_page.docx
@@ -2,7 +2,7 @@
 <file path=word/document.xml><?xml version="1.0" encoding="utf-8"?>
 <w:document xmlns:w="http://schemas.openxmlformats.org/wordprocessingml/2006/main" xmlns:m="http://schemas.openxmlformats.org/officeDocument/2006/math" xmlns:r="http://schemas.openxmlformats.org/officeDocument/2006/relationships" xmlns:o="urn:schemas-microsoft-com:office:office" xmlns:v="urn:schemas-microsoft-com:vml" xmlns:w10="urn:schemas-microsoft-com:office:word" xmlns:a="http://schemas.openxmlformats.org/drawingml/2006/main" xmlns:pic="http://schemas.openxmlformats.org/drawingml/2006/picture" xmlns:wp="http://schemas.openxmlformats.org/drawingml/2006/wordprocessingDrawing">
   <w:body>
-    <w:bookmarkStart w:id="26" w:name="author-title-page"/>
+    <w:bookmarkStart w:id="24" w:name="author-title-page"/>
     <w:p>
       <w:pPr>
         <w:pStyle w:val="Heading1"/>
@@ -20,7 +20,7 @@
           <w:iCs/>
           <w:i/>
         </w:rPr>
-        <w:t xml:space="preserve">(Submitted separately from the blinded manuscript — not for review)</w:t>
+        <w:t xml:space="preserve">(Submitted separately from the blinded manuscript, not for review)</w:t>
       </w:r>
     </w:p>
     <w:bookmarkStart w:id="20" w:name="manuscript-title"/>
@@ -59,7 +59,7 @@
       </w:r>
     </w:p>
     <w:bookmarkEnd w:id="20"/>
-    <w:bookmarkStart w:id="23" w:name="authors"/>
+    <w:bookmarkStart w:id="21" w:name="authors"/>
     <w:p>
       <w:pPr>
         <w:pStyle w:val="Heading2"/>
@@ -77,13 +77,89 @@
           <w:bCs/>
           <w:b/>
         </w:rPr>
-        <w:t xml:space="preserve">First Author —</w:t>
+        <w:t xml:space="preserve">First Author:</w:t>
       </w:r>
       <w:r>
         <w:t xml:space="preserve"> </w:t>
       </w:r>
       <w:r>
         <w:t xml:space="preserve">Đỗ Thùy Hương (Do Thuy Huong)</w:t>
+      </w:r>
+      <w:r>
+        <w:t xml:space="preserve"> </w:t>
+      </w:r>
+      <w:r>
+        <w:t xml:space="preserve">- Position: PhD Candidate</w:t>
+      </w:r>
+      <w:r>
+        <w:t xml:space="preserve"> </w:t>
+      </w:r>
+      <w:r>
+        <w:t xml:space="preserve">- Affiliation: College of Economics, Can Tho University (CTU), Vietnam</w:t>
+      </w:r>
+      <w:r>
+        <w:t xml:space="preserve"> </w:t>
+      </w:r>
+      <w:r>
+        <w:t xml:space="preserve">- Email: huongp1323001@gstudent.ctu.edu.vn</w:t>
+      </w:r>
+      <w:r>
+        <w:t xml:space="preserve"> </w:t>
+      </w:r>
+      <w:r>
+        <w:t xml:space="preserve">- ORCID: 0000-0002-7711-2487</w:t>
+      </w:r>
+    </w:p>
+    <w:p>
+      <w:pPr>
+        <w:pStyle w:val="BodyText"/>
+      </w:pPr>
+      <w:r>
+        <w:rPr>
+          <w:bCs/>
+          <w:b/>
+        </w:rPr>
+        <w:t xml:space="preserve">Corresponding Author:</w:t>
+      </w:r>
+      <w:r>
+        <w:t xml:space="preserve"> </w:t>
+      </w:r>
+      <w:r>
+        <w:t xml:space="preserve">Phan Anh Tú (Phan Anh Tu)</w:t>
+      </w:r>
+      <w:r>
+        <w:t xml:space="preserve"> </w:t>
+      </w:r>
+      <w:r>
+        <w:t xml:space="preserve">- Title: Associate Professor (PGS.TS.)</w:t>
+      </w:r>
+      <w:r>
+        <w:t xml:space="preserve"> </w:t>
+      </w:r>
+      <w:r>
+        <w:t xml:space="preserve">- Affiliation: College of Economics, Can Tho University (CTU), Vietnam</w:t>
+      </w:r>
+      <w:r>
+        <w:t xml:space="preserve"> </w:t>
+      </w:r>
+      <w:r>
+        <w:t xml:space="preserve">- Email: patu@ctu.edu.vn</w:t>
+      </w:r>
+      <w:r>
+        <w:t xml:space="preserve"> </w:t>
+      </w:r>
+      <w:r>
+        <w:t xml:space="preserve">- ORCID: 0000-0003-0667-3137</w:t>
+      </w:r>
+    </w:p>
+    <w:bookmarkEnd w:id="21"/>
+    <w:bookmarkStart w:id="22" w:name="credit-author-contributions"/>
+    <w:p>
+      <w:pPr>
+        <w:pStyle w:val="Heading2"/>
+      </w:pPr>
+      <w:r>
+        <w:t xml:space="preserve">CRediT Author Contributions</w:t>
       </w:r>
     </w:p>
     <w:p>
@@ -95,7 +171,17 @@
         <w:pStyle w:val="Compact"/>
       </w:pPr>
       <w:r>
-        <w:t xml:space="preserve">Position: PhD Candidate</w:t>
+        <w:rPr>
+          <w:bCs/>
+          <w:b/>
+        </w:rPr>
+        <w:t xml:space="preserve">Đỗ Thùy Hương:</w:t>
+      </w:r>
+      <w:r>
+        <w:t xml:space="preserve"> </w:t>
+      </w:r>
+      <w:r>
+        <w:t xml:space="preserve">Conceptualization, Methodology, Data curation, Formal analysis, Writing – original draft.</w:t>
       </w:r>
     </w:p>
     <w:p>
@@ -107,60 +193,27 @@
         <w:pStyle w:val="Compact"/>
       </w:pPr>
       <w:r>
-        <w:t xml:space="preserve">Affiliation: College of Economics, Can Tho University (CTU), Vietnam</w:t>
-      </w:r>
-    </w:p>
-    <w:p>
-      <w:pPr>
-        <w:numPr>
-          <w:ilvl w:val="0"/>
-          <w:numId w:val="1001"/>
-        </w:numPr>
-        <w:pStyle w:val="Compact"/>
-      </w:pPr>
-      <w:r>
-        <w:t xml:space="preserve">Email:</w:t>
-      </w:r>
-      <w:r>
-        <w:t xml:space="preserve"> </w:t>
-      </w:r>
-      <w:hyperlink r:id="rId21">
-        <w:r>
-          <w:rPr>
-            <w:rStyle w:val="Hyperlink"/>
-          </w:rPr>
-          <w:t xml:space="preserve">huongp1323001@gstudent.ctu.edu.vn</w:t>
-        </w:r>
-      </w:hyperlink>
-    </w:p>
-    <w:p>
-      <w:pPr>
-        <w:numPr>
-          <w:ilvl w:val="0"/>
-          <w:numId w:val="1001"/>
-        </w:numPr>
-        <w:pStyle w:val="Compact"/>
-      </w:pPr>
-      <w:r>
-        <w:t xml:space="preserve">ORCID: 0000-0002-7711-2487</w:t>
-      </w:r>
-    </w:p>
-    <w:p>
-      <w:pPr>
-        <w:pStyle w:val="FirstParagraph"/>
-      </w:pPr>
-      <w:r>
         <w:rPr>
           <w:bCs/>
           <w:b/>
         </w:rPr>
-        <w:t xml:space="preserve">Corresponding Author —</w:t>
-      </w:r>
-      <w:r>
-        <w:t xml:space="preserve"> </w:t>
-      </w:r>
-      <w:r>
-        <w:t xml:space="preserve">Phan Anh Tú (Phan Anh Tu)</w:t>
+        <w:t xml:space="preserve">Phan Anh Tú:</w:t>
+      </w:r>
+      <w:r>
+        <w:t xml:space="preserve"> </w:t>
+      </w:r>
+      <w:r>
+        <w:t xml:space="preserve">Conceptualization, Supervision, Validation, Writing – review &amp; editing.</w:t>
+      </w:r>
+    </w:p>
+    <w:bookmarkEnd w:id="22"/>
+    <w:bookmarkStart w:id="23" w:name="declarations"/>
+    <w:p>
+      <w:pPr>
+        <w:pStyle w:val="Heading2"/>
+      </w:pPr>
+      <w:r>
+        <w:t xml:space="preserve">Declarations</w:t>
       </w:r>
     </w:p>
     <w:p>
@@ -172,129 +225,6 @@
         <w:pStyle w:val="Compact"/>
       </w:pPr>
       <w:r>
-        <w:t xml:space="preserve">Title: Associate Professor (PGS.TS.)</w:t>
-      </w:r>
-    </w:p>
-    <w:p>
-      <w:pPr>
-        <w:numPr>
-          <w:ilvl w:val="0"/>
-          <w:numId w:val="1002"/>
-        </w:numPr>
-        <w:pStyle w:val="Compact"/>
-      </w:pPr>
-      <w:r>
-        <w:t xml:space="preserve">Affiliation: College of Economics, Can Tho University (CTU), Vietnam</w:t>
-      </w:r>
-    </w:p>
-    <w:p>
-      <w:pPr>
-        <w:numPr>
-          <w:ilvl w:val="0"/>
-          <w:numId w:val="1002"/>
-        </w:numPr>
-        <w:pStyle w:val="Compact"/>
-      </w:pPr>
-      <w:r>
-        <w:t xml:space="preserve">Email:</w:t>
-      </w:r>
-      <w:r>
-        <w:t xml:space="preserve"> </w:t>
-      </w:r>
-      <w:hyperlink r:id="rId22">
-        <w:r>
-          <w:rPr>
-            <w:rStyle w:val="Hyperlink"/>
-          </w:rPr>
-          <w:t xml:space="preserve">patu@ctu.edu.vn</w:t>
-        </w:r>
-      </w:hyperlink>
-    </w:p>
-    <w:p>
-      <w:pPr>
-        <w:numPr>
-          <w:ilvl w:val="0"/>
-          <w:numId w:val="1002"/>
-        </w:numPr>
-        <w:pStyle w:val="Compact"/>
-      </w:pPr>
-      <w:r>
-        <w:t xml:space="preserve">ORCID: 0000-0003-0667-3137</w:t>
-      </w:r>
-    </w:p>
-    <w:bookmarkEnd w:id="23"/>
-    <w:bookmarkStart w:id="24" w:name="credit-author-contributions"/>
-    <w:p>
-      <w:pPr>
-        <w:pStyle w:val="Heading2"/>
-      </w:pPr>
-      <w:r>
-        <w:t xml:space="preserve">CRediT Author Contributions</w:t>
-      </w:r>
-    </w:p>
-    <w:p>
-      <w:pPr>
-        <w:numPr>
-          <w:ilvl w:val="0"/>
-          <w:numId w:val="1003"/>
-        </w:numPr>
-        <w:pStyle w:val="Compact"/>
-      </w:pPr>
-      <w:r>
-        <w:rPr>
-          <w:bCs/>
-          <w:b/>
-        </w:rPr>
-        <w:t xml:space="preserve">Đỗ Thùy Hương:</w:t>
-      </w:r>
-      <w:r>
-        <w:t xml:space="preserve"> </w:t>
-      </w:r>
-      <w:r>
-        <w:t xml:space="preserve">Conceptualization, Methodology, Data curation, Formal analysis, Writing – original draft.</w:t>
-      </w:r>
-    </w:p>
-    <w:p>
-      <w:pPr>
-        <w:numPr>
-          <w:ilvl w:val="0"/>
-          <w:numId w:val="1003"/>
-        </w:numPr>
-        <w:pStyle w:val="Compact"/>
-      </w:pPr>
-      <w:r>
-        <w:rPr>
-          <w:bCs/>
-          <w:b/>
-        </w:rPr>
-        <w:t xml:space="preserve">Phan Anh Tú:</w:t>
-      </w:r>
-      <w:r>
-        <w:t xml:space="preserve"> </w:t>
-      </w:r>
-      <w:r>
-        <w:t xml:space="preserve">Conceptualization, Supervision, Validation, Writing – review &amp; editing.</w:t>
-      </w:r>
-    </w:p>
-    <w:bookmarkEnd w:id="24"/>
-    <w:bookmarkStart w:id="25" w:name="declarations"/>
-    <w:p>
-      <w:pPr>
-        <w:pStyle w:val="Heading2"/>
-      </w:pPr>
-      <w:r>
-        <w:t xml:space="preserve">Declarations</w:t>
-      </w:r>
-    </w:p>
-    <w:p>
-      <w:pPr>
-        <w:numPr>
-          <w:ilvl w:val="0"/>
-          <w:numId w:val="1004"/>
-        </w:numPr>
-        <w:pStyle w:val="Compact"/>
-      </w:pPr>
-      <w:r>
         <w:rPr>
           <w:bCs/>
           <w:b/>
@@ -324,8 +254,8 @@
         <w:t xml:space="preserve">None declared.</w:t>
       </w:r>
     </w:p>
-    <w:bookmarkEnd w:id="25"/>
-    <w:bookmarkEnd w:id="26"/>
+    <w:bookmarkEnd w:id="23"/>
+    <w:bookmarkEnd w:id="24"/>
     <w:sectPr/>
   </w:body>
 </w:document>
@@ -515,12 +445,6 @@
     <w:abstractNumId w:val="991"/>
   </w:num>
   <w:num w:numId="1002">
-    <w:abstractNumId w:val="991"/>
-  </w:num>
-  <w:num w:numId="1003">
-    <w:abstractNumId w:val="991"/>
-  </w:num>
-  <w:num w:numId="1004">
     <w:abstractNumId w:val="991"/>
   </w:num>
 </w:numbering>

</xml_diff>